<commit_message>
Bổ sung skill scope-check và security-audit-stride lấy cảm hứng từ gstack
- Thêm skill scope-check (.claude/commands): chốt scope/priority/workflow
  trước Bước Pre-0 khi yêu cầu còn mơ hồ.
- Thêm skill security-audit-stride (.claude/commands): checklist OWASP Top 10
  + STRIDE, chèn vào WF-FEATURE (Bước 10a), WF-REVIEW-CRIT (Bước 1b, bắt
  buộc), WF-REFACTOR (Bước 4a).
- Cập nhật CLAUDE.md để route 2 skill trên vào đúng workflow.
- Bổ sung mục "Lessons & Quyết định quan trọng" vào CODE-GRAPH-template.md
  (tương đương GBrain của gstack) để lưu quyết định + lý do, không chỉ
  trạng thái code.

Co-Authored-By: Claude Sonnet 5 <noreply@anthropic.com>
Claude-Session: https://claude.ai/code/session_016sRT77hC1Qgi9srVj2rAkp
</commit_message>
<xml_diff>
--- a/.claude/templates/CODE-GRAPH-template.docx
+++ b/.claude/templates/CODE-GRAPH-template.docx
@@ -2681,6 +2681,306 @@
           <w:color w:val="F05922"/>
           <w:sz w:val="28"/>
         </w:rPr>
+        <w:t>Lessons &amp; Quyết định quan trọng (bộ nhớ bền vững — lấy cảm hứng từ GBrain của gstack)</w:t>
+      </w:r>
+    </w:p>
+    <w:p>
+      <w:pPr>
+        <w:spacing w:before="40" w:after="40"/>
+        <w:ind w:left="567"/>
+        <w:pBdr>
+          <w:left w:val="single" w:sz="12" w:space="10" w:color="F05922"/>
+        </w:pBdr>
+      </w:pPr>
+      <w:r>
+        <w:rPr>
+          <w:color w:val="4A3F8C"/>
+        </w:rPr>
+        <w:t>Ghi lại QUYẾT ĐỊNH + LÝ DO, không chỉ trạng thái code — giúp agent sau không suy luận lại từ đầu hoặc lặp lại sai lầm đã biết.</w:t>
+      </w:r>
+    </w:p>
+    <w:tbl>
+      <w:tblPr>
+        <w:tblStyle w:val="TableGrid"/>
+        <w:tblW w:type="auto" w:w="0"/>
+        <w:tblLook w:firstColumn="1" w:firstRow="1" w:lastColumn="0" w:lastRow="0" w:noHBand="0" w:noVBand="1" w:val="04A0"/>
+      </w:tblPr>
+      <w:tblGrid>
+        <w:gridCol w:w="2422"/>
+        <w:gridCol w:w="2422"/>
+        <w:gridCol w:w="2422"/>
+        <w:gridCol w:w="2422"/>
+      </w:tblGrid>
+      <w:tr>
+        <w:tc>
+          <w:tcPr>
+            <w:tcW w:type="dxa" w:w="2422"/>
+            <w:shd w:val="clear" w:color="auto" w:fill="251C53"/>
+            <w:tcBorders>
+              <w:top w:val="single" w:sz="4" w:space="0" w:color="251C53"/>
+              <w:left w:val="single" w:sz="4" w:space="0" w:color="251C53"/>
+              <w:bottom w:val="single" w:sz="4" w:space="0" w:color="251C53"/>
+              <w:right w:val="single" w:sz="4" w:space="0" w:color="251C53"/>
+            </w:tcBorders>
+          </w:tcPr>
+          <w:p>
+            <w:r>
+              <w:rPr>
+                <w:b/>
+                <w:color w:val="FFFFFF"/>
+                <w:sz w:val="20"/>
+              </w:rPr>
+              <w:t>Ngày</w:t>
+            </w:r>
+          </w:p>
+        </w:tc>
+        <w:tc>
+          <w:tcPr>
+            <w:tcW w:type="dxa" w:w="2422"/>
+            <w:shd w:val="clear" w:color="auto" w:fill="251C53"/>
+            <w:tcBorders>
+              <w:top w:val="single" w:sz="4" w:space="0" w:color="251C53"/>
+              <w:left w:val="single" w:sz="4" w:space="0" w:color="251C53"/>
+              <w:bottom w:val="single" w:sz="4" w:space="0" w:color="251C53"/>
+              <w:right w:val="single" w:sz="4" w:space="0" w:color="251C53"/>
+            </w:tcBorders>
+          </w:tcPr>
+          <w:p>
+            <w:r>
+              <w:rPr>
+                <w:b/>
+                <w:color w:val="FFFFFF"/>
+                <w:sz w:val="20"/>
+              </w:rPr>
+              <w:t>Quyết định / Bài học</w:t>
+            </w:r>
+          </w:p>
+        </w:tc>
+        <w:tc>
+          <w:tcPr>
+            <w:tcW w:type="dxa" w:w="2422"/>
+            <w:shd w:val="clear" w:color="auto" w:fill="251C53"/>
+            <w:tcBorders>
+              <w:top w:val="single" w:sz="4" w:space="0" w:color="251C53"/>
+              <w:left w:val="single" w:sz="4" w:space="0" w:color="251C53"/>
+              <w:bottom w:val="single" w:sz="4" w:space="0" w:color="251C53"/>
+              <w:right w:val="single" w:sz="4" w:space="0" w:color="251C53"/>
+            </w:tcBorders>
+          </w:tcPr>
+          <w:p>
+            <w:r>
+              <w:rPr>
+                <w:b/>
+                <w:color w:val="FFFFFF"/>
+                <w:sz w:val="20"/>
+              </w:rPr>
+              <w:t>Lý do (WHY)</w:t>
+            </w:r>
+          </w:p>
+        </w:tc>
+        <w:tc>
+          <w:tcPr>
+            <w:tcW w:type="dxa" w:w="2422"/>
+            <w:shd w:val="clear" w:color="auto" w:fill="251C53"/>
+            <w:tcBorders>
+              <w:top w:val="single" w:sz="4" w:space="0" w:color="251C53"/>
+              <w:left w:val="single" w:sz="4" w:space="0" w:color="251C53"/>
+              <w:bottom w:val="single" w:sz="4" w:space="0" w:color="251C53"/>
+              <w:right w:val="single" w:sz="4" w:space="0" w:color="251C53"/>
+            </w:tcBorders>
+          </w:tcPr>
+          <w:p>
+            <w:r>
+              <w:rPr>
+                <w:b/>
+                <w:color w:val="FFFFFF"/>
+                <w:sz w:val="20"/>
+              </w:rPr>
+              <w:t>Agent ghi nhận</w:t>
+            </w:r>
+          </w:p>
+        </w:tc>
+      </w:tr>
+      <w:tr>
+        <w:tc>
+          <w:tcPr>
+            <w:tcW w:type="dxa" w:w="2422"/>
+            <w:tcBorders>
+              <w:top w:val="single" w:sz="4" w:space="0" w:color="CBCBCB"/>
+              <w:left w:val="single" w:sz="4" w:space="0" w:color="CBCBCB"/>
+              <w:bottom w:val="single" w:sz="4" w:space="0" w:color="CBCBCB"/>
+              <w:right w:val="single" w:sz="4" w:space="0" w:color="CBCBCB"/>
+            </w:tcBorders>
+          </w:tcPr>
+          <w:p>
+            <w:r>
+              <w:rPr>
+                <w:sz w:val="20"/>
+              </w:rPr>
+              <w:t>------</w:t>
+            </w:r>
+          </w:p>
+        </w:tc>
+        <w:tc>
+          <w:tcPr>
+            <w:tcW w:type="dxa" w:w="2422"/>
+            <w:tcBorders>
+              <w:top w:val="single" w:sz="4" w:space="0" w:color="CBCBCB"/>
+              <w:left w:val="single" w:sz="4" w:space="0" w:color="CBCBCB"/>
+              <w:bottom w:val="single" w:sz="4" w:space="0" w:color="CBCBCB"/>
+              <w:right w:val="single" w:sz="4" w:space="0" w:color="CBCBCB"/>
+            </w:tcBorders>
+          </w:tcPr>
+          <w:p>
+            <w:r>
+              <w:rPr>
+                <w:sz w:val="20"/>
+              </w:rPr>
+              <w:t>----------------------</w:t>
+            </w:r>
+          </w:p>
+        </w:tc>
+        <w:tc>
+          <w:tcPr>
+            <w:tcW w:type="dxa" w:w="2422"/>
+            <w:tcBorders>
+              <w:top w:val="single" w:sz="4" w:space="0" w:color="CBCBCB"/>
+              <w:left w:val="single" w:sz="4" w:space="0" w:color="CBCBCB"/>
+              <w:bottom w:val="single" w:sz="4" w:space="0" w:color="CBCBCB"/>
+              <w:right w:val="single" w:sz="4" w:space="0" w:color="CBCBCB"/>
+            </w:tcBorders>
+          </w:tcPr>
+          <w:p>
+            <w:r>
+              <w:rPr>
+                <w:sz w:val="20"/>
+              </w:rPr>
+              <w:t>--------------</w:t>
+            </w:r>
+          </w:p>
+        </w:tc>
+        <w:tc>
+          <w:tcPr>
+            <w:tcW w:type="dxa" w:w="2422"/>
+            <w:tcBorders>
+              <w:top w:val="single" w:sz="4" w:space="0" w:color="CBCBCB"/>
+              <w:left w:val="single" w:sz="4" w:space="0" w:color="CBCBCB"/>
+              <w:bottom w:val="single" w:sz="4" w:space="0" w:color="CBCBCB"/>
+              <w:right w:val="single" w:sz="4" w:space="0" w:color="CBCBCB"/>
+            </w:tcBorders>
+          </w:tcPr>
+          <w:p>
+            <w:r>
+              <w:rPr>
+                <w:sz w:val="20"/>
+              </w:rPr>
+              <w:t>-----------------</w:t>
+            </w:r>
+          </w:p>
+        </w:tc>
+      </w:tr>
+      <w:tr>
+        <w:tc>
+          <w:tcPr>
+            <w:tcW w:type="dxa" w:w="2422"/>
+            <w:shd w:val="clear" w:color="auto" w:fill="B8B3D6"/>
+            <w:tcBorders>
+              <w:top w:val="single" w:sz="4" w:space="0" w:color="CBCBCB"/>
+              <w:left w:val="single" w:sz="4" w:space="0" w:color="CBCBCB"/>
+              <w:bottom w:val="single" w:sz="4" w:space="0" w:color="CBCBCB"/>
+              <w:right w:val="single" w:sz="4" w:space="0" w:color="CBCBCB"/>
+            </w:tcBorders>
+          </w:tcPr>
+          <w:p>
+            <w:r>
+              <w:rPr>
+                <w:sz w:val="20"/>
+              </w:rPr>
+              <w:t>YYYY-MM-DD</w:t>
+            </w:r>
+          </w:p>
+        </w:tc>
+        <w:tc>
+          <w:tcPr>
+            <w:tcW w:type="dxa" w:w="2422"/>
+            <w:shd w:val="clear" w:color="auto" w:fill="B8B3D6"/>
+            <w:tcBorders>
+              <w:top w:val="single" w:sz="4" w:space="0" w:color="CBCBCB"/>
+              <w:left w:val="single" w:sz="4" w:space="0" w:color="CBCBCB"/>
+              <w:bottom w:val="single" w:sz="4" w:space="0" w:color="CBCBCB"/>
+              <w:right w:val="single" w:sz="4" w:space="0" w:color="CBCBCB"/>
+            </w:tcBorders>
+          </w:tcPr>
+          <w:p>
+            <w:r>
+              <w:rPr>
+                <w:sz w:val="20"/>
+              </w:rPr>
+              <w:t>[vd: Chọn KzDataGrid thay vì DataGridView gốc]</w:t>
+            </w:r>
+          </w:p>
+        </w:tc>
+        <w:tc>
+          <w:tcPr>
+            <w:tcW w:type="dxa" w:w="2422"/>
+            <w:shd w:val="clear" w:color="auto" w:fill="B8B3D6"/>
+            <w:tcBorders>
+              <w:top w:val="single" w:sz="4" w:space="0" w:color="CBCBCB"/>
+              <w:left w:val="single" w:sz="4" w:space="0" w:color="CBCBCB"/>
+              <w:bottom w:val="single" w:sz="4" w:space="0" w:color="CBCBCB"/>
+              <w:right w:val="single" w:sz="4" w:space="0" w:color="CBCBCB"/>
+            </w:tcBorders>
+          </w:tcPr>
+          <w:p>
+            <w:r>
+              <w:rPr>
+                <w:sz w:val="20"/>
+              </w:rPr>
+              <w:t>[vd: đã thử DataGridView gốc, không hỗ trợ virtualization → lag với &gt;10k dòng]</w:t>
+            </w:r>
+          </w:p>
+        </w:tc>
+        <w:tc>
+          <w:tcPr>
+            <w:tcW w:type="dxa" w:w="2422"/>
+            <w:shd w:val="clear" w:color="auto" w:fill="B8B3D6"/>
+            <w:tcBorders>
+              <w:top w:val="single" w:sz="4" w:space="0" w:color="CBCBCB"/>
+              <w:left w:val="single" w:sz="4" w:space="0" w:color="CBCBCB"/>
+              <w:bottom w:val="single" w:sz="4" w:space="0" w:color="CBCBCB"/>
+              <w:right w:val="single" w:sz="4" w:space="0" w:color="CBCBCB"/>
+            </w:tcBorders>
+          </w:tcPr>
+          <w:p>
+            <w:r>
+              <w:rPr>
+                <w:sz w:val="20"/>
+              </w:rPr>
+              <w:t>[agent-name]</w:t>
+            </w:r>
+          </w:p>
+        </w:tc>
+      </w:tr>
+    </w:tbl>
+    <w:p/>
+    <w:p>
+      <w:pPr>
+        <w:pBdr>
+          <w:bottom w:val="single" w:sz="6" w:space="1" w:color="F05922"/>
+        </w:pBdr>
+        <w:spacing w:after="120"/>
+      </w:pPr>
+    </w:p>
+    <w:p>
+      <w:pPr>
+        <w:pStyle w:val="Heading2"/>
+        <w:spacing w:before="200" w:after="80"/>
+      </w:pPr>
+      <w:r>
+        <w:rPr>
+          <w:color w:val="F05922"/>
+          <w:sz w:val="28"/>
+        </w:rPr>
         <w:t>Ghi chú đặc biệt</w:t>
       </w:r>
     </w:p>

</xml_diff>